<commit_message>
Fixed problem of email appearing on the second column in the custom template
</commit_message>
<xml_diff>
--- a/IPAC26/templates/JACoW_MSWord_ipac26_custom.docx
+++ b/IPAC26/templates/JACoW_MSWord_ipac26_custom.docx
@@ -91,273 +91,6 @@
         <w:pStyle w:val="JACoWBodyTextIndent"/>
       </w:pPr>
       <w:r>
-        <w:t xml:space="preserve">This </w:t>
-      </w:r>
-      <w:r>
-        <w:t>short document</w:t>
-      </w:r>
-      <w:r>
-        <w:t xml:space="preserve"> exemplifies the use of the JACoW formatting style in Microsoft Word, thereby highlighting the most salient features of the JACoW </w:t>
-      </w:r>
-      <w:r>
-        <w:t>template</w:t>
-      </w:r>
-      <w:r>
-        <w:t>. It is provided principally to facilitate authors in expediting a correctly formatted JACoW manuscript in Word. It is expected that authors will have already familiarized themselves with the contents of</w:t>
-      </w:r>
-      <w:r>
-        <w:t xml:space="preserve"> the</w:t>
-      </w:r>
-      <w:r>
-        <w:t xml:space="preserve"> </w:t>
-      </w:r>
-      <w:r>
-        <w:t>“</w:t>
-      </w:r>
-      <w:r>
-        <w:t>Style Guide for JACoW Conference Papers</w:t>
-      </w:r>
-      <w:r>
-        <w:t>”</w:t>
-      </w:r>
-      <w:r>
-        <w:t xml:space="preserve"> </w:t>
-      </w:r>
-      <w:r>
-        <w:t>document</w:t>
-      </w:r>
-      <w:r>
-        <w:t xml:space="preserve"> available from </w:t>
-      </w:r>
-      <w:r>
-        <w:t>the JACoW website </w:t>
-      </w:r>
-      <w:r>
-        <w:t>[1].</w:t>
-      </w:r>
-    </w:p>
-    <w:p>
-      <w:pPr>
-        <w:pStyle w:val="JACoWSubsectionHeading"/>
-      </w:pPr>
-      <w:r>
-        <w:t>Bulleted</w:t>
-      </w:r>
-      <w:r>
-        <w:t xml:space="preserve"> Lists</w:t>
-      </w:r>
-    </w:p>
-    <w:p>
-      <w:pPr>
-        <w:pStyle w:val="JACoWBodyTextIndent"/>
-      </w:pPr>
-      <w:r>
-        <w:t>A list has left (0.33 cm) and hanging (0.36 cm) indent</w:t>
-      </w:r>
-      <w:r>
-        <w:t>ations</w:t>
-      </w:r>
-      <w:r>
-        <w:t>:</w:t>
-      </w:r>
-    </w:p>
-    <w:p>
-      <w:pPr>
-        <w:pStyle w:val="JACoWBulletedList"/>
-      </w:pPr>
-      <w:r>
-        <w:t>Item one.</w:t>
-      </w:r>
-    </w:p>
-    <w:p>
-      <w:pPr>
-        <w:pStyle w:val="JACoWBulletedList"/>
-      </w:pPr>
-      <w:r>
-        <w:t>Item two.</w:t>
-      </w:r>
-    </w:p>
-    <w:p>
-      <w:pPr>
-        <w:pStyle w:val="JACoWBulletedList"/>
-      </w:pPr>
-      <w:r>
-        <w:t>Item three.</w:t>
-      </w:r>
-    </w:p>
-    <w:p>
-      <w:pPr>
-        <w:pStyle w:val="JACoWSubsectionHeading"/>
-      </w:pPr>
-      <w:r>
-        <w:t>Figure Captions</w:t>
-      </w:r>
-    </w:p>
-    <w:p>
-      <w:pPr>
-        <w:pStyle w:val="JACoWBodyTextIndent"/>
-      </w:pPr>
-      <w:r>
-        <w:t>Figure captions are placed below the figure and centred if on one line (Fig.</w:t>
-      </w:r>
-      <w:r>
-        <w:t xml:space="preserve"> 1)</w:t>
-      </w:r>
-      <w:r>
-        <w:t xml:space="preserve"> </w:t>
-      </w:r>
-      <w:r>
-        <w:t xml:space="preserve">but justified if spanning multiple lines (Fig. 2). </w:t>
-      </w:r>
-    </w:p>
-    <w:p>
-      <w:pPr>
-        <w:pStyle w:val="JACoWFigorFootnoteTextBox"/>
-      </w:pPr>
-      <w:r>
-        <w:rPr>
-          <w:noProof/>
-          <w:lang w:val="en-US"/>
-        </w:rPr>
-        <w:drawing>
-          <wp:inline distT="0" distB="0" distL="0" distR="0" wp14:anchorId="093C89FB" wp14:editId="72861C66">
-            <wp:extent cx="525702" cy="525702"/>
-            <wp:effectExtent l="0" t="0" r="0" b="8255"/>
-            <wp:docPr id="1" name="Picture 1" descr="Programmer female with solid fill"/>
-            <wp:cNvGraphicFramePr>
-              <a:graphicFrameLocks xmlns:a="http://schemas.openxmlformats.org/drawingml/2006/main" noChangeAspect="1"/>
-            </wp:cNvGraphicFramePr>
-            <a:graphic xmlns:a="http://schemas.openxmlformats.org/drawingml/2006/main">
-              <a:graphicData uri="http://schemas.openxmlformats.org/drawingml/2006/picture">
-                <pic:pic xmlns:pic="http://schemas.openxmlformats.org/drawingml/2006/picture">
-                  <pic:nvPicPr>
-                    <pic:cNvPr id="1" name="Picture 1" descr="Programmer female with solid fill"/>
-                    <pic:cNvPicPr/>
-                  </pic:nvPicPr>
-                  <pic:blipFill>
-                    <a:blip r:embed="rId8">
-                      <a:extLst>
-                        <a:ext uri="{96DAC541-7B7A-43D3-8B79-37D633B846F1}">
-                          <asvg:svgBlip xmlns:asvg="http://schemas.microsoft.com/office/drawing/2016/SVG/main" r:embed="rId9"/>
-                        </a:ext>
-                      </a:extLst>
-                    </a:blip>
-                    <a:stretch>
-                      <a:fillRect/>
-                    </a:stretch>
-                  </pic:blipFill>
-                  <pic:spPr>
-                    <a:xfrm>
-                      <a:off x="0" y="0"/>
-                      <a:ext cx="525702" cy="525702"/>
-                    </a:xfrm>
-                    <a:prstGeom prst="rect">
-                      <a:avLst/>
-                    </a:prstGeom>
-                  </pic:spPr>
-                </pic:pic>
-              </a:graphicData>
-            </a:graphic>
-          </wp:inline>
-        </w:drawing>
-      </w:r>
-    </w:p>
-    <w:p>
-      <w:pPr>
-        <w:pStyle w:val="JACoWFigCaption"/>
-        <w:keepNext w:val="0"/>
-      </w:pPr>
-      <w:r>
-        <w:t>Figure 1: A one line figure caption is cent</w:t>
-      </w:r>
-      <w:r>
-        <w:t>e</w:t>
-      </w:r>
-      <w:r>
-        <w:t>red.</w:t>
-      </w:r>
-    </w:p>
-    <w:p>
-      <w:pPr>
-        <w:pStyle w:val="JACoWFigorFootnoteTextBox"/>
-      </w:pPr>
-      <w:r>
-        <w:rPr>
-          <w:noProof/>
-          <w:lang w:val="en-US"/>
-        </w:rPr>
-        <w:drawing>
-          <wp:inline distT="0" distB="0" distL="0" distR="0" wp14:anchorId="1DFC7A6E" wp14:editId="79F18DB9">
-            <wp:extent cx="607202" cy="607202"/>
-            <wp:effectExtent l="0" t="0" r="0" b="2540"/>
-            <wp:docPr id="11" name="Picture 11" descr="Programmer male with solid fill"/>
-            <wp:cNvGraphicFramePr>
-              <a:graphicFrameLocks xmlns:a="http://schemas.openxmlformats.org/drawingml/2006/main" noChangeAspect="1"/>
-            </wp:cNvGraphicFramePr>
-            <a:graphic xmlns:a="http://schemas.openxmlformats.org/drawingml/2006/main">
-              <a:graphicData uri="http://schemas.openxmlformats.org/drawingml/2006/picture">
-                <pic:pic xmlns:pic="http://schemas.openxmlformats.org/drawingml/2006/picture">
-                  <pic:nvPicPr>
-                    <pic:cNvPr id="11" name="Picture 11" descr="Programmer male with solid fill"/>
-                    <pic:cNvPicPr/>
-                  </pic:nvPicPr>
-                  <pic:blipFill>
-                    <a:blip r:embed="rId10">
-                      <a:extLst>
-                        <a:ext uri="{96DAC541-7B7A-43D3-8B79-37D633B846F1}">
-                          <asvg:svgBlip xmlns:asvg="http://schemas.microsoft.com/office/drawing/2016/SVG/main" r:embed="rId11"/>
-                        </a:ext>
-                      </a:extLst>
-                    </a:blip>
-                    <a:stretch>
-                      <a:fillRect/>
-                    </a:stretch>
-                  </pic:blipFill>
-                  <pic:spPr>
-                    <a:xfrm>
-                      <a:off x="0" y="0"/>
-                      <a:ext cx="607202" cy="607202"/>
-                    </a:xfrm>
-                    <a:prstGeom prst="rect">
-                      <a:avLst/>
-                    </a:prstGeom>
-                  </pic:spPr>
-                </pic:pic>
-              </a:graphicData>
-            </a:graphic>
-          </wp:inline>
-        </w:drawing>
-      </w:r>
-    </w:p>
-    <w:p>
-      <w:pPr>
-        <w:pStyle w:val="JACoWFigCaptionMultiLine"/>
-      </w:pPr>
-      <w:r>
-        <w:t>Figure 2: A lengthy figure caption that spans multiple lines is justified.</w:t>
-      </w:r>
-    </w:p>
-    <w:p>
-      <w:pPr>
-        <w:pStyle w:val="JACoWBodyTextIndent"/>
-      </w:pPr>
-      <w:r>
-        <w:t>Note the colon “:” after the figure number and the period “.” at the end of the caption.</w:t>
-      </w:r>
-    </w:p>
-    <w:p>
-      <w:pPr>
-        <w:pStyle w:val="JACoWSubsectionHeading"/>
-      </w:pPr>
-      <w:r>
-        <w:t>Table Headings</w:t>
-      </w:r>
-    </w:p>
-    <w:p>
-      <w:pPr>
-        <w:pStyle w:val="JACoWBodyTextIndent"/>
-      </w:pPr>
-      <w:r>
         <w:rPr>
           <w:noProof/>
           <w:lang w:val="en-US"/>
@@ -368,10 +101,10 @@
               <wp:anchor distT="0" distB="0" distL="114300" distR="114300" simplePos="0" relativeHeight="251659264" behindDoc="0" locked="0" layoutInCell="1" allowOverlap="0" wp14:anchorId="42D6E226" wp14:editId="48AEB408">
                 <wp:simplePos x="0" y="0"/>
                 <wp:positionH relativeFrom="column">
-                  <wp:posOffset>10795</wp:posOffset>
+                  <wp:posOffset>13557</wp:posOffset>
                 </wp:positionH>
                 <wp:positionV relativeFrom="page">
-                  <wp:posOffset>8994775</wp:posOffset>
+                  <wp:posOffset>8995144</wp:posOffset>
                 </wp:positionV>
                 <wp:extent cx="2962275" cy="342900"/>
                 <wp:effectExtent l="0" t="0" r="9525" b="0"/>
@@ -467,7 +200,7 @@
                 <v:stroke joinstyle="miter"/>
                 <v:path gradientshapeok="t" o:connecttype="rect"/>
               </v:shapetype>
-              <v:shape id="Text Box 38" o:spid="_x0000_s1026" type="#_x0000_t202" style="position:absolute;left:0;text-align:left;margin-left:.85pt;margin-top:708.25pt;width:233.25pt;height:27pt;z-index:251659264;visibility:visible;mso-wrap-style:square;mso-width-percent:0;mso-height-percent:0;mso-wrap-distance-left:9pt;mso-wrap-distance-top:0;mso-wrap-distance-right:9pt;mso-wrap-distance-bottom:0;mso-position-horizontal:absolute;mso-position-horizontal-relative:text;mso-position-vertical:absolute;mso-position-vertical-relative:page;mso-width-percent:0;mso-height-percent:0;mso-width-relative:page;mso-height-relative:page;v-text-anchor:top" o:gfxdata="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" o:allowoverlap="f" filled="f" stroked="f">
+              <v:shape id="Text Box 38" o:spid="_x0000_s1026" type="#_x0000_t202" style="position:absolute;left:0;text-align:left;margin-left:1.05pt;margin-top:708.3pt;width:233.25pt;height:27pt;z-index:251659264;visibility:visible;mso-wrap-style:square;mso-width-percent:0;mso-height-percent:0;mso-wrap-distance-left:9pt;mso-wrap-distance-top:0;mso-wrap-distance-right:9pt;mso-wrap-distance-bottom:0;mso-position-horizontal:absolute;mso-position-horizontal-relative:text;mso-position-vertical:absolute;mso-position-vertical-relative:page;mso-width-percent:0;mso-height-percent:0;mso-width-relative:page;mso-height-relative:page;v-text-anchor:top" o:gfxdata="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" o:allowoverlap="f" filled="f" stroked="f">
                 <v:textbox inset="0,0,0,0">
                   <w:txbxContent>
                     <w:p>
@@ -502,6 +235,273 @@
           </mc:Fallback>
         </mc:AlternateContent>
       </w:r>
+      <w:r>
+        <w:t xml:space="preserve">This </w:t>
+      </w:r>
+      <w:r>
+        <w:t>short document</w:t>
+      </w:r>
+      <w:r>
+        <w:t xml:space="preserve"> exemplifies the use of the JACoW formatting style in Microsoft Word, thereby highlighting the most salient features of the JACoW </w:t>
+      </w:r>
+      <w:r>
+        <w:t>template</w:t>
+      </w:r>
+      <w:r>
+        <w:t>. It is provided principally to facilitate authors in expediting a correctly formatted JACoW manuscript in Word. It is expected that authors will have already familiarized themselves with the contents of</w:t>
+      </w:r>
+      <w:r>
+        <w:t xml:space="preserve"> the</w:t>
+      </w:r>
+      <w:r>
+        <w:t xml:space="preserve"> </w:t>
+      </w:r>
+      <w:r>
+        <w:t>“</w:t>
+      </w:r>
+      <w:r>
+        <w:t>Style Guide for JACoW Conference Papers</w:t>
+      </w:r>
+      <w:r>
+        <w:t>”</w:t>
+      </w:r>
+      <w:r>
+        <w:t xml:space="preserve"> </w:t>
+      </w:r>
+      <w:r>
+        <w:t>document</w:t>
+      </w:r>
+      <w:r>
+        <w:t xml:space="preserve"> available from </w:t>
+      </w:r>
+      <w:r>
+        <w:t>the JACoW website </w:t>
+      </w:r>
+      <w:r>
+        <w:t>[1].</w:t>
+      </w:r>
+    </w:p>
+    <w:p>
+      <w:pPr>
+        <w:pStyle w:val="JACoWSubsectionHeading"/>
+      </w:pPr>
+      <w:r>
+        <w:t>Bulleted</w:t>
+      </w:r>
+      <w:r>
+        <w:t xml:space="preserve"> Lists</w:t>
+      </w:r>
+    </w:p>
+    <w:p>
+      <w:pPr>
+        <w:pStyle w:val="JACoWBodyTextIndent"/>
+      </w:pPr>
+      <w:r>
+        <w:t>A list has left (0.33 cm) and hanging (0.36 cm) indent</w:t>
+      </w:r>
+      <w:r>
+        <w:t>ations</w:t>
+      </w:r>
+      <w:r>
+        <w:t>:</w:t>
+      </w:r>
+    </w:p>
+    <w:p>
+      <w:pPr>
+        <w:pStyle w:val="JACoWBulletedList"/>
+      </w:pPr>
+      <w:r>
+        <w:t>Item one.</w:t>
+      </w:r>
+    </w:p>
+    <w:p>
+      <w:pPr>
+        <w:pStyle w:val="JACoWBulletedList"/>
+      </w:pPr>
+      <w:r>
+        <w:t>Item two.</w:t>
+      </w:r>
+    </w:p>
+    <w:p>
+      <w:pPr>
+        <w:pStyle w:val="JACoWBulletedList"/>
+      </w:pPr>
+      <w:r>
+        <w:t>Item three.</w:t>
+      </w:r>
+    </w:p>
+    <w:p>
+      <w:pPr>
+        <w:pStyle w:val="JACoWSubsectionHeading"/>
+      </w:pPr>
+      <w:r>
+        <w:t>Figure Captions</w:t>
+      </w:r>
+    </w:p>
+    <w:p>
+      <w:pPr>
+        <w:pStyle w:val="JACoWBodyTextIndent"/>
+      </w:pPr>
+      <w:r>
+        <w:t>Figure captions are placed below the figure and centred if on one line (Fig.</w:t>
+      </w:r>
+      <w:r>
+        <w:t xml:space="preserve"> 1)</w:t>
+      </w:r>
+      <w:r>
+        <w:t xml:space="preserve"> </w:t>
+      </w:r>
+      <w:r>
+        <w:t xml:space="preserve">but justified if spanning multiple lines (Fig. 2). </w:t>
+      </w:r>
+    </w:p>
+    <w:p>
+      <w:pPr>
+        <w:pStyle w:val="JACoWFigorFootnoteTextBox"/>
+      </w:pPr>
+      <w:r>
+        <w:rPr>
+          <w:noProof/>
+          <w:lang w:val="en-US"/>
+        </w:rPr>
+        <w:drawing>
+          <wp:inline distT="0" distB="0" distL="0" distR="0" wp14:anchorId="093C89FB" wp14:editId="72861C66">
+            <wp:extent cx="525702" cy="525702"/>
+            <wp:effectExtent l="0" t="0" r="0" b="8255"/>
+            <wp:docPr id="1" name="Picture 1" descr="Programmer female with solid fill"/>
+            <wp:cNvGraphicFramePr>
+              <a:graphicFrameLocks xmlns:a="http://schemas.openxmlformats.org/drawingml/2006/main" noChangeAspect="1"/>
+            </wp:cNvGraphicFramePr>
+            <a:graphic xmlns:a="http://schemas.openxmlformats.org/drawingml/2006/main">
+              <a:graphicData uri="http://schemas.openxmlformats.org/drawingml/2006/picture">
+                <pic:pic xmlns:pic="http://schemas.openxmlformats.org/drawingml/2006/picture">
+                  <pic:nvPicPr>
+                    <pic:cNvPr id="1" name="Picture 1" descr="Programmer female with solid fill"/>
+                    <pic:cNvPicPr/>
+                  </pic:nvPicPr>
+                  <pic:blipFill>
+                    <a:blip r:embed="rId8">
+                      <a:extLst>
+                        <a:ext uri="{96DAC541-7B7A-43D3-8B79-37D633B846F1}">
+                          <asvg:svgBlip xmlns:asvg="http://schemas.microsoft.com/office/drawing/2016/SVG/main" r:embed="rId9"/>
+                        </a:ext>
+                      </a:extLst>
+                    </a:blip>
+                    <a:stretch>
+                      <a:fillRect/>
+                    </a:stretch>
+                  </pic:blipFill>
+                  <pic:spPr>
+                    <a:xfrm>
+                      <a:off x="0" y="0"/>
+                      <a:ext cx="525702" cy="525702"/>
+                    </a:xfrm>
+                    <a:prstGeom prst="rect">
+                      <a:avLst/>
+                    </a:prstGeom>
+                  </pic:spPr>
+                </pic:pic>
+              </a:graphicData>
+            </a:graphic>
+          </wp:inline>
+        </w:drawing>
+      </w:r>
+    </w:p>
+    <w:p>
+      <w:pPr>
+        <w:pStyle w:val="JACoWFigCaption"/>
+        <w:keepNext w:val="0"/>
+      </w:pPr>
+      <w:r>
+        <w:t>Figure 1: A one line figure caption is cent</w:t>
+      </w:r>
+      <w:r>
+        <w:t>e</w:t>
+      </w:r>
+      <w:r>
+        <w:t>red.</w:t>
+      </w:r>
+    </w:p>
+    <w:p>
+      <w:pPr>
+        <w:pStyle w:val="JACoWFigorFootnoteTextBox"/>
+      </w:pPr>
+      <w:r>
+        <w:rPr>
+          <w:noProof/>
+          <w:lang w:val="en-US"/>
+        </w:rPr>
+        <w:drawing>
+          <wp:inline distT="0" distB="0" distL="0" distR="0" wp14:anchorId="1DFC7A6E" wp14:editId="79F18DB9">
+            <wp:extent cx="607202" cy="607202"/>
+            <wp:effectExtent l="0" t="0" r="0" b="2540"/>
+            <wp:docPr id="11" name="Picture 11" descr="Programmer male with solid fill"/>
+            <wp:cNvGraphicFramePr>
+              <a:graphicFrameLocks xmlns:a="http://schemas.openxmlformats.org/drawingml/2006/main" noChangeAspect="1"/>
+            </wp:cNvGraphicFramePr>
+            <a:graphic xmlns:a="http://schemas.openxmlformats.org/drawingml/2006/main">
+              <a:graphicData uri="http://schemas.openxmlformats.org/drawingml/2006/picture">
+                <pic:pic xmlns:pic="http://schemas.openxmlformats.org/drawingml/2006/picture">
+                  <pic:nvPicPr>
+                    <pic:cNvPr id="11" name="Picture 11" descr="Programmer male with solid fill"/>
+                    <pic:cNvPicPr/>
+                  </pic:nvPicPr>
+                  <pic:blipFill>
+                    <a:blip r:embed="rId10">
+                      <a:extLst>
+                        <a:ext uri="{96DAC541-7B7A-43D3-8B79-37D633B846F1}">
+                          <asvg:svgBlip xmlns:asvg="http://schemas.microsoft.com/office/drawing/2016/SVG/main" r:embed="rId11"/>
+                        </a:ext>
+                      </a:extLst>
+                    </a:blip>
+                    <a:stretch>
+                      <a:fillRect/>
+                    </a:stretch>
+                  </pic:blipFill>
+                  <pic:spPr>
+                    <a:xfrm>
+                      <a:off x="0" y="0"/>
+                      <a:ext cx="607202" cy="607202"/>
+                    </a:xfrm>
+                    <a:prstGeom prst="rect">
+                      <a:avLst/>
+                    </a:prstGeom>
+                  </pic:spPr>
+                </pic:pic>
+              </a:graphicData>
+            </a:graphic>
+          </wp:inline>
+        </w:drawing>
+      </w:r>
+    </w:p>
+    <w:p>
+      <w:pPr>
+        <w:pStyle w:val="JACoWFigCaptionMultiLine"/>
+      </w:pPr>
+      <w:r>
+        <w:t>Figure 2: A lengthy figure caption that spans multiple lines is justified.</w:t>
+      </w:r>
+    </w:p>
+    <w:p>
+      <w:pPr>
+        <w:pStyle w:val="JACoWBodyTextIndent"/>
+      </w:pPr>
+      <w:r>
+        <w:t>Note the colon “:” after the figure number and the period “.” at the end of the caption.</w:t>
+      </w:r>
+    </w:p>
+    <w:p>
+      <w:pPr>
+        <w:pStyle w:val="JACoWSubsectionHeading"/>
+      </w:pPr>
+      <w:r>
+        <w:t>Table Headings</w:t>
+      </w:r>
+    </w:p>
+    <w:p>
+      <w:pPr>
+        <w:pStyle w:val="JACoWBodyTextIndent"/>
+      </w:pPr>
       <w:r>
         <w:t xml:space="preserve">Tables should be neatly formatted with a heading placed above the table, and centred if on one line, as in Table 1, but justified if spanning two or more lines. A description of the table contents should be confined to the text of the paper and not in the table </w:t>
       </w:r>

</xml_diff>